<commit_message>
docs: capturas + SQL de evidencias
</commit_message>
<xml_diff>
--- a/evidencias/EVIDENCIA_NORMA_220501095_Plancity.docx
+++ b/evidencias/EVIDENCIA_NORMA_220501095_Plancity.docx
@@ -7755,6 +7755,42 @@
       </w:r>
     </w:p>
     <w:p>
+      <w:r>
+        <w:drawing>
+          <wp:inline xmlns:a="http://schemas.openxmlformats.org/drawingml/2006/main" xmlns:pic="http://schemas.openxmlformats.org/drawingml/2006/picture">
+            <wp:extent cx="5400000" cy="12776250"/>
+            <wp:docPr id="7" name="Picture 7"/>
+            <wp:cNvGraphicFramePr>
+              <a:graphicFrameLocks noChangeAspect="1"/>
+            </wp:cNvGraphicFramePr>
+            <a:graphic>
+              <a:graphicData uri="http://schemas.openxmlformats.org/drawingml/2006/picture">
+                <pic:pic>
+                  <pic:nvPicPr>
+                    <pic:cNvPr id="0" name="01-home.png"/>
+                    <pic:cNvPicPr/>
+                  </pic:nvPicPr>
+                  <pic:blipFill>
+                    <a:blip r:embed="rId20"/>
+                    <a:stretch>
+                      <a:fillRect/>
+                    </a:stretch>
+                  </pic:blipFill>
+                  <pic:spPr>
+                    <a:xfrm>
+                      <a:off x="0" y="0"/>
+                      <a:ext cx="5400000" cy="12776250"/>
+                    </a:xfrm>
+                    <a:prstGeom prst="rect"/>
+                  </pic:spPr>
+                </pic:pic>
+              </a:graphicData>
+            </a:graphic>
+          </wp:inline>
+        </w:drawing>
+      </w:r>
+    </w:p>
+    <w:p>
       <w:pPr>
         <w:pStyle w:val="Heading2"/>
       </w:pPr>
@@ -7786,6 +7822,78 @@
       </w:r>
     </w:p>
     <w:p>
+      <w:r>
+        <w:drawing>
+          <wp:inline xmlns:a="http://schemas.openxmlformats.org/drawingml/2006/main" xmlns:pic="http://schemas.openxmlformats.org/drawingml/2006/picture">
+            <wp:extent cx="5400000" cy="4312500"/>
+            <wp:docPr id="6" name="Picture 6"/>
+            <wp:cNvGraphicFramePr>
+              <a:graphicFrameLocks noChangeAspect="1"/>
+            </wp:cNvGraphicFramePr>
+            <a:graphic>
+              <a:graphicData uri="http://schemas.openxmlformats.org/drawingml/2006/picture">
+                <pic:pic>
+                  <pic:nvPicPr>
+                    <pic:cNvPr id="0" name="02-eventos.png"/>
+                    <pic:cNvPicPr/>
+                  </pic:nvPicPr>
+                  <pic:blipFill>
+                    <a:blip r:embed="rId19"/>
+                    <a:stretch>
+                      <a:fillRect/>
+                    </a:stretch>
+                  </pic:blipFill>
+                  <pic:spPr>
+                    <a:xfrm>
+                      <a:off x="0" y="0"/>
+                      <a:ext cx="5400000" cy="4312500"/>
+                    </a:xfrm>
+                    <a:prstGeom prst="rect"/>
+                  </pic:spPr>
+                </pic:pic>
+              </a:graphicData>
+            </a:graphic>
+          </wp:inline>
+        </w:drawing>
+      </w:r>
+    </w:p>
+    <w:p>
+      <w:r>
+        <w:drawing>
+          <wp:inline xmlns:a="http://schemas.openxmlformats.org/drawingml/2006/main" xmlns:pic="http://schemas.openxmlformats.org/drawingml/2006/picture">
+            <wp:extent cx="5400000" cy="4312500"/>
+            <wp:docPr id="5" name="Picture 5"/>
+            <wp:cNvGraphicFramePr>
+              <a:graphicFrameLocks noChangeAspect="1"/>
+            </wp:cNvGraphicFramePr>
+            <a:graphic>
+              <a:graphicData uri="http://schemas.openxmlformats.org/drawingml/2006/picture">
+                <pic:pic>
+                  <pic:nvPicPr>
+                    <pic:cNvPr id="0" name="03-detalle.png"/>
+                    <pic:cNvPicPr/>
+                  </pic:nvPicPr>
+                  <pic:blipFill>
+                    <a:blip r:embed="rId18"/>
+                    <a:stretch>
+                      <a:fillRect/>
+                    </a:stretch>
+                  </pic:blipFill>
+                  <pic:spPr>
+                    <a:xfrm>
+                      <a:off x="0" y="0"/>
+                      <a:ext cx="5400000" cy="4312500"/>
+                    </a:xfrm>
+                    <a:prstGeom prst="rect"/>
+                  </pic:spPr>
+                </pic:pic>
+              </a:graphicData>
+            </a:graphic>
+          </wp:inline>
+        </w:drawing>
+      </w:r>
+    </w:p>
+    <w:p>
       <w:pPr>
         <w:pStyle w:val="Heading2"/>
       </w:pPr>
@@ -7817,6 +7925,42 @@
       </w:r>
     </w:p>
     <w:p>
+      <w:r>
+        <w:drawing>
+          <wp:inline xmlns:a="http://schemas.openxmlformats.org/drawingml/2006/main" xmlns:pic="http://schemas.openxmlformats.org/drawingml/2006/picture">
+            <wp:extent cx="5400000" cy="4312500"/>
+            <wp:docPr id="4" name="Picture 4"/>
+            <wp:cNvGraphicFramePr>
+              <a:graphicFrameLocks noChangeAspect="1"/>
+            </wp:cNvGraphicFramePr>
+            <a:graphic>
+              <a:graphicData uri="http://schemas.openxmlformats.org/drawingml/2006/picture">
+                <pic:pic>
+                  <pic:nvPicPr>
+                    <pic:cNvPr id="0" name="04-favoritos.png"/>
+                    <pic:cNvPicPr/>
+                  </pic:nvPicPr>
+                  <pic:blipFill>
+                    <a:blip r:embed="rId17"/>
+                    <a:stretch>
+                      <a:fillRect/>
+                    </a:stretch>
+                  </pic:blipFill>
+                  <pic:spPr>
+                    <a:xfrm>
+                      <a:off x="0" y="0"/>
+                      <a:ext cx="5400000" cy="4312500"/>
+                    </a:xfrm>
+                    <a:prstGeom prst="rect"/>
+                  </pic:spPr>
+                </pic:pic>
+              </a:graphicData>
+            </a:graphic>
+          </wp:inline>
+        </w:drawing>
+      </w:r>
+    </w:p>
+    <w:p>
       <w:pPr>
         <w:pStyle w:val="Heading2"/>
       </w:pPr>
@@ -7845,6 +7989,78 @@
           <w:szCs w:val="22"/>
         </w:rPr>
         <w:t xml:space="preserve">Los formularios de acceso y administración validan cada campo con las reglas de los DTO (correo, mínimo de 6 caracteres, UUID de categoría, URL de imágenes, máximo de diez imágenes) y exhiben los mensajes del servidor, incluidos los conflictos de nombre o correo duplicado.</w:t>
+      </w:r>
+    </w:p>
+    <w:p>
+      <w:r>
+        <w:drawing>
+          <wp:inline xmlns:a="http://schemas.openxmlformats.org/drawingml/2006/main" xmlns:pic="http://schemas.openxmlformats.org/drawingml/2006/picture">
+            <wp:extent cx="5400000" cy="5508750"/>
+            <wp:docPr id="3" name="Picture 3"/>
+            <wp:cNvGraphicFramePr>
+              <a:graphicFrameLocks noChangeAspect="1"/>
+            </wp:cNvGraphicFramePr>
+            <a:graphic>
+              <a:graphicData uri="http://schemas.openxmlformats.org/drawingml/2006/picture">
+                <pic:pic>
+                  <pic:nvPicPr>
+                    <pic:cNvPr id="0" name="05-admin-evento.png"/>
+                    <pic:cNvPicPr/>
+                  </pic:nvPicPr>
+                  <pic:blipFill>
+                    <a:blip r:embed="rId16"/>
+                    <a:stretch>
+                      <a:fillRect/>
+                    </a:stretch>
+                  </pic:blipFill>
+                  <pic:spPr>
+                    <a:xfrm>
+                      <a:off x="0" y="0"/>
+                      <a:ext cx="5400000" cy="5508750"/>
+                    </a:xfrm>
+                    <a:prstGeom prst="rect"/>
+                  </pic:spPr>
+                </pic:pic>
+              </a:graphicData>
+            </a:graphic>
+          </wp:inline>
+        </w:drawing>
+      </w:r>
+    </w:p>
+    <w:p>
+      <w:r>
+        <w:drawing>
+          <wp:inline xmlns:a="http://schemas.openxmlformats.org/drawingml/2006/main" xmlns:pic="http://schemas.openxmlformats.org/drawingml/2006/picture">
+            <wp:extent cx="5400000" cy="4312500"/>
+            <wp:docPr id="2" name="Picture 2"/>
+            <wp:cNvGraphicFramePr>
+              <a:graphicFrameLocks noChangeAspect="1"/>
+            </wp:cNvGraphicFramePr>
+            <a:graphic>
+              <a:graphicData uri="http://schemas.openxmlformats.org/drawingml/2006/picture">
+                <pic:pic>
+                  <pic:nvPicPr>
+                    <pic:cNvPr id="0" name="06-login.png"/>
+                    <pic:cNvPicPr/>
+                  </pic:nvPicPr>
+                  <pic:blipFill>
+                    <a:blip r:embed="rId15"/>
+                    <a:stretch>
+                      <a:fillRect/>
+                    </a:stretch>
+                  </pic:blipFill>
+                  <pic:spPr>
+                    <a:xfrm>
+                      <a:off x="0" y="0"/>
+                      <a:ext cx="5400000" cy="4312500"/>
+                    </a:xfrm>
+                    <a:prstGeom prst="rect"/>
+                  </pic:spPr>
+                </pic:pic>
+              </a:graphicData>
+            </a:graphic>
+          </wp:inline>
+        </w:drawing>
       </w:r>
     </w:p>
     <w:p>

</xml_diff>

<commit_message>
docs: evidencias con arboles completos y capturas integradas
- 096 §1.1 con trees tal cual del repo (api + frontend, 60 archivos src)
- 095 §3 y 096 §2.7 con las 6 capturas incrustadas (figuras 8-13 y 2-6)
</commit_message>
<xml_diff>
--- a/evidencias/EVIDENCIA_NORMA_220501095_Plancity.docx
+++ b/evidencias/EVIDENCIA_NORMA_220501095_Plancity.docx
@@ -7755,33 +7755,43 @@
       </w:r>
     </w:p>
     <w:p>
+      <w:pPr>
+        <w:spacing w:after="60" w:before="120"/>
+        <w:jc w:val="center"/>
+      </w:pPr>
       <w:r>
         <w:drawing>
-          <wp:inline xmlns:a="http://schemas.openxmlformats.org/drawingml/2006/main" xmlns:pic="http://schemas.openxmlformats.org/drawingml/2006/picture">
-            <wp:extent cx="5400000" cy="12776250"/>
-            <wp:docPr id="7" name="Picture 7"/>
+          <wp:inline distT="0" distB="0" distL="0" distR="0">
+            <wp:extent cx="5619750" cy="13296900"/>
+            <wp:effectExtent t="0" r="0" b="0" l="0"/>
+            <wp:docPr id="1" name="" descr="" title=""/>
             <wp:cNvGraphicFramePr>
-              <a:graphicFrameLocks noChangeAspect="1"/>
+              <a:graphicFrameLocks xmlns:a="http://schemas.openxmlformats.org/drawingml/2006/main" noChangeAspect="1"/>
             </wp:cNvGraphicFramePr>
-            <a:graphic>
+            <a:graphic xmlns:a="http://schemas.openxmlformats.org/drawingml/2006/main">
               <a:graphicData uri="http://schemas.openxmlformats.org/drawingml/2006/picture">
-                <pic:pic>
+                <pic:pic xmlns:pic="http://schemas.openxmlformats.org/drawingml/2006/picture">
                   <pic:nvPicPr>
-                    <pic:cNvPr id="0" name="01-home.png"/>
-                    <pic:cNvPicPr/>
+                    <pic:cNvPr id="0" name="" descr=""/>
+                    <pic:cNvPicPr>
+                      <a:picLocks noChangeAspect="1" noChangeArrowheads="1"/>
+                    </pic:cNvPicPr>
                   </pic:nvPicPr>
                   <pic:blipFill>
-                    <a:blip r:embed="rId20"/>
+                    <a:blip r:embed="rId13" cstate="none"/>
+                    <a:srcRect/>
                     <a:stretch>
                       <a:fillRect/>
                     </a:stretch>
                   </pic:blipFill>
-                  <pic:spPr>
+                  <pic:spPr bwMode="auto">
                     <a:xfrm>
                       <a:off x="0" y="0"/>
-                      <a:ext cx="5400000" cy="12776250"/>
+                      <a:ext cx="5619750" cy="13296900"/>
                     </a:xfrm>
-                    <a:prstGeom prst="rect"/>
+                    <a:prstGeom prst="rect">
+                      <a:avLst/>
+                    </a:prstGeom>
                   </pic:spPr>
                 </pic:pic>
               </a:graphicData>
@@ -7792,6 +7802,23 @@
     </w:p>
     <w:p>
       <w:pPr>
+        <w:spacing w:after="200"/>
+        <w:jc w:val="center"/>
+      </w:pPr>
+      <w:r>
+        <w:rPr>
+          <w:rFonts w:ascii="Arial" w:cs="Arial" w:eastAsia="Arial" w:hAnsi="Arial"/>
+          <w:i/>
+          <w:iCs/>
+          <w:color w:val="595959"/>
+          <w:sz w:val="20"/>
+          <w:szCs w:val="20"/>
+        </w:rPr>
+        <w:t xml:space="preserve">Figura 8. Pantalla principal de PlanCity.</w:t>
+      </w:r>
+    </w:p>
+    <w:p>
+      <w:pPr>
         <w:pStyle w:val="Heading2"/>
       </w:pPr>
       <w:r>
@@ -7822,33 +7849,43 @@
       </w:r>
     </w:p>
     <w:p>
+      <w:pPr>
+        <w:spacing w:after="60" w:before="120"/>
+        <w:jc w:val="center"/>
+      </w:pPr>
       <w:r>
         <w:drawing>
-          <wp:inline xmlns:a="http://schemas.openxmlformats.org/drawingml/2006/main" xmlns:pic="http://schemas.openxmlformats.org/drawingml/2006/picture">
-            <wp:extent cx="5400000" cy="4312500"/>
-            <wp:docPr id="6" name="Picture 6"/>
+          <wp:inline distT="0" distB="0" distL="0" distR="0">
+            <wp:extent cx="5619750" cy="4486275"/>
+            <wp:effectExtent t="0" r="0" b="0" l="0"/>
+            <wp:docPr id="1" name="" descr="" title=""/>
             <wp:cNvGraphicFramePr>
-              <a:graphicFrameLocks noChangeAspect="1"/>
+              <a:graphicFrameLocks xmlns:a="http://schemas.openxmlformats.org/drawingml/2006/main" noChangeAspect="1"/>
             </wp:cNvGraphicFramePr>
-            <a:graphic>
+            <a:graphic xmlns:a="http://schemas.openxmlformats.org/drawingml/2006/main">
               <a:graphicData uri="http://schemas.openxmlformats.org/drawingml/2006/picture">
-                <pic:pic>
+                <pic:pic xmlns:pic="http://schemas.openxmlformats.org/drawingml/2006/picture">
                   <pic:nvPicPr>
-                    <pic:cNvPr id="0" name="02-eventos.png"/>
-                    <pic:cNvPicPr/>
+                    <pic:cNvPr id="0" name="" descr=""/>
+                    <pic:cNvPicPr>
+                      <a:picLocks noChangeAspect="1" noChangeArrowheads="1"/>
+                    </pic:cNvPicPr>
                   </pic:nvPicPr>
                   <pic:blipFill>
-                    <a:blip r:embed="rId19"/>
+                    <a:blip r:embed="rId14" cstate="none"/>
+                    <a:srcRect/>
                     <a:stretch>
                       <a:fillRect/>
                     </a:stretch>
                   </pic:blipFill>
-                  <pic:spPr>
+                  <pic:spPr bwMode="auto">
                     <a:xfrm>
                       <a:off x="0" y="0"/>
-                      <a:ext cx="5400000" cy="4312500"/>
+                      <a:ext cx="5619750" cy="4486275"/>
                     </a:xfrm>
-                    <a:prstGeom prst="rect"/>
+                    <a:prstGeom prst="rect">
+                      <a:avLst/>
+                    </a:prstGeom>
                   </pic:spPr>
                 </pic:pic>
               </a:graphicData>
@@ -7858,33 +7895,60 @@
       </w:r>
     </w:p>
     <w:p>
+      <w:pPr>
+        <w:spacing w:after="200"/>
+        <w:jc w:val="center"/>
+      </w:pPr>
+      <w:r>
+        <w:rPr>
+          <w:rFonts w:ascii="Arial" w:cs="Arial" w:eastAsia="Arial" w:hAnsi="Arial"/>
+          <w:i/>
+          <w:iCs/>
+          <w:color w:val="595959"/>
+          <w:sz w:val="20"/>
+          <w:szCs w:val="20"/>
+        </w:rPr>
+        <w:t xml:space="preserve">Figura 9. Gestión de eventos: listado con filtros.</w:t>
+      </w:r>
+    </w:p>
+    <w:p>
+      <w:pPr>
+        <w:spacing w:after="60" w:before="120"/>
+        <w:jc w:val="center"/>
+      </w:pPr>
       <w:r>
         <w:drawing>
-          <wp:inline xmlns:a="http://schemas.openxmlformats.org/drawingml/2006/main" xmlns:pic="http://schemas.openxmlformats.org/drawingml/2006/picture">
-            <wp:extent cx="5400000" cy="4312500"/>
-            <wp:docPr id="5" name="Picture 5"/>
+          <wp:inline distT="0" distB="0" distL="0" distR="0">
+            <wp:extent cx="5619750" cy="4486275"/>
+            <wp:effectExtent t="0" r="0" b="0" l="0"/>
+            <wp:docPr id="1" name="" descr="" title=""/>
             <wp:cNvGraphicFramePr>
-              <a:graphicFrameLocks noChangeAspect="1"/>
+              <a:graphicFrameLocks xmlns:a="http://schemas.openxmlformats.org/drawingml/2006/main" noChangeAspect="1"/>
             </wp:cNvGraphicFramePr>
-            <a:graphic>
+            <a:graphic xmlns:a="http://schemas.openxmlformats.org/drawingml/2006/main">
               <a:graphicData uri="http://schemas.openxmlformats.org/drawingml/2006/picture">
-                <pic:pic>
+                <pic:pic xmlns:pic="http://schemas.openxmlformats.org/drawingml/2006/picture">
                   <pic:nvPicPr>
-                    <pic:cNvPr id="0" name="03-detalle.png"/>
-                    <pic:cNvPicPr/>
+                    <pic:cNvPr id="0" name="" descr=""/>
+                    <pic:cNvPicPr>
+                      <a:picLocks noChangeAspect="1" noChangeArrowheads="1"/>
+                    </pic:cNvPicPr>
                   </pic:nvPicPr>
                   <pic:blipFill>
-                    <a:blip r:embed="rId18"/>
+                    <a:blip r:embed="rId15" cstate="none"/>
+                    <a:srcRect/>
                     <a:stretch>
                       <a:fillRect/>
                     </a:stretch>
                   </pic:blipFill>
-                  <pic:spPr>
+                  <pic:spPr bwMode="auto">
                     <a:xfrm>
                       <a:off x="0" y="0"/>
-                      <a:ext cx="5400000" cy="4312500"/>
+                      <a:ext cx="5619750" cy="4486275"/>
                     </a:xfrm>
-                    <a:prstGeom prst="rect"/>
+                    <a:prstGeom prst="rect">
+                      <a:avLst/>
+                    </a:prstGeom>
                   </pic:spPr>
                 </pic:pic>
               </a:graphicData>
@@ -7895,6 +7959,23 @@
     </w:p>
     <w:p>
       <w:pPr>
+        <w:spacing w:after="200"/>
+        <w:jc w:val="center"/>
+      </w:pPr>
+      <w:r>
+        <w:rPr>
+          <w:rFonts w:ascii="Arial" w:cs="Arial" w:eastAsia="Arial" w:hAnsi="Arial"/>
+          <w:i/>
+          <w:iCs/>
+          <w:color w:val="595959"/>
+          <w:sz w:val="20"/>
+          <w:szCs w:val="20"/>
+        </w:rPr>
+        <w:t xml:space="preserve">Figura 10. Detalle de evento con galería y relacionados.</w:t>
+      </w:r>
+    </w:p>
+    <w:p>
+      <w:pPr>
         <w:pStyle w:val="Heading2"/>
       </w:pPr>
       <w:r>
@@ -7925,33 +8006,43 @@
       </w:r>
     </w:p>
     <w:p>
+      <w:pPr>
+        <w:spacing w:after="60" w:before="120"/>
+        <w:jc w:val="center"/>
+      </w:pPr>
       <w:r>
         <w:drawing>
-          <wp:inline xmlns:a="http://schemas.openxmlformats.org/drawingml/2006/main" xmlns:pic="http://schemas.openxmlformats.org/drawingml/2006/picture">
-            <wp:extent cx="5400000" cy="4312500"/>
-            <wp:docPr id="4" name="Picture 4"/>
+          <wp:inline distT="0" distB="0" distL="0" distR="0">
+            <wp:extent cx="5619750" cy="4486275"/>
+            <wp:effectExtent t="0" r="0" b="0" l="0"/>
+            <wp:docPr id="1" name="" descr="" title=""/>
             <wp:cNvGraphicFramePr>
-              <a:graphicFrameLocks noChangeAspect="1"/>
+              <a:graphicFrameLocks xmlns:a="http://schemas.openxmlformats.org/drawingml/2006/main" noChangeAspect="1"/>
             </wp:cNvGraphicFramePr>
-            <a:graphic>
+            <a:graphic xmlns:a="http://schemas.openxmlformats.org/drawingml/2006/main">
               <a:graphicData uri="http://schemas.openxmlformats.org/drawingml/2006/picture">
-                <pic:pic>
+                <pic:pic xmlns:pic="http://schemas.openxmlformats.org/drawingml/2006/picture">
                   <pic:nvPicPr>
-                    <pic:cNvPr id="0" name="04-favoritos.png"/>
-                    <pic:cNvPicPr/>
+                    <pic:cNvPr id="0" name="" descr=""/>
+                    <pic:cNvPicPr>
+                      <a:picLocks noChangeAspect="1" noChangeArrowheads="1"/>
+                    </pic:cNvPicPr>
                   </pic:nvPicPr>
                   <pic:blipFill>
-                    <a:blip r:embed="rId17"/>
+                    <a:blip r:embed="rId16" cstate="none"/>
+                    <a:srcRect/>
                     <a:stretch>
                       <a:fillRect/>
                     </a:stretch>
                   </pic:blipFill>
-                  <pic:spPr>
+                  <pic:spPr bwMode="auto">
                     <a:xfrm>
                       <a:off x="0" y="0"/>
-                      <a:ext cx="5400000" cy="4312500"/>
+                      <a:ext cx="5619750" cy="4486275"/>
                     </a:xfrm>
-                    <a:prstGeom prst="rect"/>
+                    <a:prstGeom prst="rect">
+                      <a:avLst/>
+                    </a:prstGeom>
                   </pic:spPr>
                 </pic:pic>
               </a:graphicData>
@@ -7962,6 +8053,23 @@
     </w:p>
     <w:p>
       <w:pPr>
+        <w:spacing w:after="200"/>
+        <w:jc w:val="center"/>
+      </w:pPr>
+      <w:r>
+        <w:rPr>
+          <w:rFonts w:ascii="Arial" w:cs="Arial" w:eastAsia="Arial" w:hAnsi="Arial"/>
+          <w:i/>
+          <w:iCs/>
+          <w:color w:val="595959"/>
+          <w:sz w:val="20"/>
+          <w:szCs w:val="20"/>
+        </w:rPr>
+        <w:t xml:space="preserve">Figura 11. Gestión de favoritos personales.</w:t>
+      </w:r>
+    </w:p>
+    <w:p>
+      <w:pPr>
         <w:pStyle w:val="Heading2"/>
       </w:pPr>
       <w:r>
@@ -7992,33 +8100,43 @@
       </w:r>
     </w:p>
     <w:p>
+      <w:pPr>
+        <w:spacing w:after="60" w:before="120"/>
+        <w:jc w:val="center"/>
+      </w:pPr>
       <w:r>
         <w:drawing>
-          <wp:inline xmlns:a="http://schemas.openxmlformats.org/drawingml/2006/main" xmlns:pic="http://schemas.openxmlformats.org/drawingml/2006/picture">
-            <wp:extent cx="5400000" cy="5508750"/>
-            <wp:docPr id="3" name="Picture 3"/>
+          <wp:inline distT="0" distB="0" distL="0" distR="0">
+            <wp:extent cx="5619750" cy="5734050"/>
+            <wp:effectExtent t="0" r="0" b="0" l="0"/>
+            <wp:docPr id="1" name="" descr="" title=""/>
             <wp:cNvGraphicFramePr>
-              <a:graphicFrameLocks noChangeAspect="1"/>
+              <a:graphicFrameLocks xmlns:a="http://schemas.openxmlformats.org/drawingml/2006/main" noChangeAspect="1"/>
             </wp:cNvGraphicFramePr>
-            <a:graphic>
+            <a:graphic xmlns:a="http://schemas.openxmlformats.org/drawingml/2006/main">
               <a:graphicData uri="http://schemas.openxmlformats.org/drawingml/2006/picture">
-                <pic:pic>
+                <pic:pic xmlns:pic="http://schemas.openxmlformats.org/drawingml/2006/picture">
                   <pic:nvPicPr>
-                    <pic:cNvPr id="0" name="05-admin-evento.png"/>
-                    <pic:cNvPicPr/>
+                    <pic:cNvPr id="0" name="" descr=""/>
+                    <pic:cNvPicPr>
+                      <a:picLocks noChangeAspect="1" noChangeArrowheads="1"/>
+                    </pic:cNvPicPr>
                   </pic:nvPicPr>
                   <pic:blipFill>
-                    <a:blip r:embed="rId16"/>
+                    <a:blip r:embed="rId17" cstate="none"/>
+                    <a:srcRect/>
                     <a:stretch>
                       <a:fillRect/>
                     </a:stretch>
                   </pic:blipFill>
-                  <pic:spPr>
+                  <pic:spPr bwMode="auto">
                     <a:xfrm>
                       <a:off x="0" y="0"/>
-                      <a:ext cx="5400000" cy="5508750"/>
+                      <a:ext cx="5619750" cy="5734050"/>
                     </a:xfrm>
-                    <a:prstGeom prst="rect"/>
+                    <a:prstGeom prst="rect">
+                      <a:avLst/>
+                    </a:prstGeom>
                   </pic:spPr>
                 </pic:pic>
               </a:graphicData>
@@ -8028,39 +8146,83 @@
       </w:r>
     </w:p>
     <w:p>
+      <w:pPr>
+        <w:spacing w:after="200"/>
+        <w:jc w:val="center"/>
+      </w:pPr>
+      <w:r>
+        <w:rPr>
+          <w:rFonts w:ascii="Arial" w:cs="Arial" w:eastAsia="Arial" w:hAnsi="Arial"/>
+          <w:i/>
+          <w:iCs/>
+          <w:color w:val="595959"/>
+          <w:sz w:val="20"/>
+          <w:szCs w:val="20"/>
+        </w:rPr>
+        <w:t xml:space="preserve">Figura 12. Formulario de administración con validaciones.</w:t>
+      </w:r>
+    </w:p>
+    <w:p>
+      <w:pPr>
+        <w:spacing w:after="60" w:before="120"/>
+        <w:jc w:val="center"/>
+      </w:pPr>
       <w:r>
         <w:drawing>
-          <wp:inline xmlns:a="http://schemas.openxmlformats.org/drawingml/2006/main" xmlns:pic="http://schemas.openxmlformats.org/drawingml/2006/picture">
-            <wp:extent cx="5400000" cy="4312500"/>
-            <wp:docPr id="2" name="Picture 2"/>
+          <wp:inline distT="0" distB="0" distL="0" distR="0">
+            <wp:extent cx="5619750" cy="4486275"/>
+            <wp:effectExtent t="0" r="0" b="0" l="0"/>
+            <wp:docPr id="1" name="" descr="" title=""/>
             <wp:cNvGraphicFramePr>
-              <a:graphicFrameLocks noChangeAspect="1"/>
+              <a:graphicFrameLocks xmlns:a="http://schemas.openxmlformats.org/drawingml/2006/main" noChangeAspect="1"/>
             </wp:cNvGraphicFramePr>
-            <a:graphic>
+            <a:graphic xmlns:a="http://schemas.openxmlformats.org/drawingml/2006/main">
               <a:graphicData uri="http://schemas.openxmlformats.org/drawingml/2006/picture">
-                <pic:pic>
+                <pic:pic xmlns:pic="http://schemas.openxmlformats.org/drawingml/2006/picture">
                   <pic:nvPicPr>
-                    <pic:cNvPr id="0" name="06-login.png"/>
-                    <pic:cNvPicPr/>
+                    <pic:cNvPr id="0" name="" descr=""/>
+                    <pic:cNvPicPr>
+                      <a:picLocks noChangeAspect="1" noChangeArrowheads="1"/>
+                    </pic:cNvPicPr>
                   </pic:nvPicPr>
                   <pic:blipFill>
-                    <a:blip r:embed="rId15"/>
+                    <a:blip r:embed="rId18" cstate="none"/>
+                    <a:srcRect/>
                     <a:stretch>
                       <a:fillRect/>
                     </a:stretch>
                   </pic:blipFill>
-                  <pic:spPr>
+                  <pic:spPr bwMode="auto">
                     <a:xfrm>
                       <a:off x="0" y="0"/>
-                      <a:ext cx="5400000" cy="4312500"/>
+                      <a:ext cx="5619750" cy="4486275"/>
                     </a:xfrm>
-                    <a:prstGeom prst="rect"/>
+                    <a:prstGeom prst="rect">
+                      <a:avLst/>
+                    </a:prstGeom>
                   </pic:spPr>
                 </pic:pic>
               </a:graphicData>
             </a:graphic>
           </wp:inline>
         </w:drawing>
+      </w:r>
+    </w:p>
+    <w:p>
+      <w:pPr>
+        <w:spacing w:after="200"/>
+        <w:jc w:val="center"/>
+      </w:pPr>
+      <w:r>
+        <w:rPr>
+          <w:rFonts w:ascii="Arial" w:cs="Arial" w:eastAsia="Arial" w:hAnsi="Arial"/>
+          <w:i/>
+          <w:iCs/>
+          <w:color w:val="595959"/>
+          <w:sz w:val="20"/>
+          <w:szCs w:val="20"/>
+        </w:rPr>
+        <w:t xml:space="preserve">Figura 13. Formulario de acceso.</w:t>
       </w:r>
     </w:p>
     <w:p>
@@ -8118,7 +8280,7 @@
                     </pic:cNvPicPr>
                   </pic:nvPicPr>
                   <pic:blipFill>
-                    <a:blip r:embed="rId13" cstate="none"/>
+                    <a:blip r:embed="rId19" cstate="none"/>
                     <a:srcRect/>
                     <a:stretch>
                       <a:fillRect/>

</xml_diff>